<commit_message>
Fase 6: evaluasi & UML EcoMatch — docx Bab 2-4 direfresh (evaluasi 30 skenario: busuk 87,68 vs 56,88%, gabungan tidak segar 73,78 vs 56,33%, jarak 30,18 vs 20,68 km, sensitivitas BATAS_SKOR, kecepatan 0,29 ms/0,21 dtk, tabel 3.1-4.1 + 3 contoh nyata seed 3), chart image3/image4 diganti (metrik % + jarak, kurva sensitivitas dual-axis), scripts/evaluasi-30-skenario.js + hasil JSON, docs/pengujian/Laporan_Evaluasi_System.md (naskah uji), docs/arsitektur/UML_EcoMatch.drawio 12 halaman (generator scripts/gen_uml_drawio.py dari mermaid + 2 diagram turunan kode), dokumen arsitektur: audit name ROUTE_NOT_FOUND/LOG_PENGOLAHAN + actor Admin di 5.7 + checklist Fase 6 ☑, package rename ke ecomatch
</commit_message>
<xml_diff>
--- a/docs/Laporan_Project_EcoMatch_v1.0.docx
+++ b/docs/Laporan_Project_EcoMatch_v1.0.docx
@@ -2261,6 +2261,69 @@
                 <w:szCs w:val="22"/>
               </w:rPr>
               <w:t>Mendukung tujuan mengurangi sampah yang berakhir di TPS biasa.</w:t>
+            </w:r>
+          </w:p>
+        </w:tc>
+      </w:tr>
+      <w:tr>
+        <w:trPr>
+          <w:cantSplit/>
+        </w:trPr>
+        <w:tc>
+          <w:tcPr>
+            <w:tcW w:w="3400" w:type="dxa"/>
+            <w:tcBorders>
+              <w:top w:val="single" w:sz="4" w:space="0" w:color="000000"/>
+              <w:left w:val="single" w:sz="4" w:space="0" w:color="000000"/>
+              <w:bottom w:val="single" w:sz="4" w:space="0" w:color="000000"/>
+              <w:right w:val="single" w:sz="4" w:space="0" w:color="000000"/>
+            </w:tcBorders>
+            <w:tcMar>
+              <w:top w:w="60" w:type="dxa"/>
+              <w:left w:w="100" w:type="dxa"/>
+              <w:bottom w:w="60" w:type="dxa"/>
+              <w:right w:w="100" w:type="dxa"/>
+            </w:tcMar>
+          </w:tcPr>
+          <w:p>
+            <w:pPr>
+              <w:keepNext/>
+            </w:pPr>
+            <w:r>
+              <w:rPr>
+                <w:sz w:val="22"/>
+                <w:szCs w:val="22"/>
+              </w:rPr>
+              <w:t>% sampah tidak segar (sedang/busuk) teralokasi</w:t>
+            </w:r>
+          </w:p>
+        </w:tc>
+        <w:tc>
+          <w:tcPr>
+            <w:tcW w:w="5626" w:type="dxa"/>
+            <w:tcBorders>
+              <w:top w:val="single" w:sz="4" w:space="0" w:color="000000"/>
+              <w:left w:val="single" w:sz="4" w:space="0" w:color="000000"/>
+              <w:bottom w:val="single" w:sz="4" w:space="0" w:color="000000"/>
+              <w:right w:val="single" w:sz="4" w:space="0" w:color="000000"/>
+            </w:tcBorders>
+            <w:tcMar>
+              <w:top w:w="60" w:type="dxa"/>
+              <w:left w:w="100" w:type="dxa"/>
+              <w:bottom w:w="60" w:type="dxa"/>
+              <w:right w:w="100" w:type="dxa"/>
+            </w:tcMar>
+          </w:tcPr>
+          <w:p>
+            <w:pPr>
+              <w:keepNext/>
+            </w:pPr>
+            <w:r>
+              <w:rPr>
+                <w:sz w:val="22"/>
+                <w:szCs w:val="22"/>
+              </w:rPr>
+              <w:t>Metrik gabungan: memastikan sampah yang mendekati masa busuk tetap tersalur ke TPS Pengolah.</w:t>
             </w:r>
           </w:p>
         </w:tc>
@@ -3254,7 +3317,7 @@
                 <w:sz w:val="22"/>
                 <w:szCs w:val="22"/>
               </w:rPr>
-              <w:t>random, pandas</w:t>
+              <w:t>Database PostgreSQL; generator mulberry32 untuk evaluasi</w:t>
             </w:r>
           </w:p>
         </w:tc>
@@ -3375,7 +3438,7 @@
                 <w:sz w:val="22"/>
                 <w:szCs w:val="22"/>
               </w:rPr>
-              <w:t>Python (loop)</w:t>
+              <w:t>Loop kandidat (server/lib/routing.js)</w:t>
             </w:r>
           </w:p>
         </w:tc>
@@ -3496,7 +3559,7 @@
                 <w:sz w:val="22"/>
                 <w:szCs w:val="22"/>
               </w:rPr>
-              <w:t>Haversine (math)</w:t>
+              <w:t>haversineKm (server/lib/gis.js)</w:t>
             </w:r>
           </w:p>
         </w:tc>
@@ -3617,7 +3680,7 @@
                 <w:sz w:val="22"/>
                 <w:szCs w:val="22"/>
               </w:rPr>
-              <w:t>Fungsi skor (routing.js)</w:t>
+              <w:t>hitungSkor (server/lib/routing.js)</w:t>
             </w:r>
           </w:p>
         </w:tc>
@@ -4101,7 +4164,7 @@
                 <w:sz w:val="22"/>
                 <w:szCs w:val="22"/>
               </w:rPr>
-              <w:t>pandas</w:t>
+              <w:t>JSON respons /v1/routing</w:t>
             </w:r>
           </w:p>
         </w:tc>
@@ -4158,8 +4221,7 @@
         <w:jc w:val="both"/>
       </w:pPr>
       <w:r>
-        <w:lastRenderedPageBreak/>
-        <w:t>Jarak adalah jarak dari lokasi Donor MBG ke lokasi TPS Pengolah, dihitung dengan rumus haversine (radius bumi 6.371 km) dan diperbarui dengan jarak rute jalan dari OSRM bila tersedia; radius maksimal penjemputan 15 km. Aturan skor tiap kriteria adalah sebagai berikut.</w:t>
+        <w:t>Jarak adalah jarak dari lokasi Donor MBG ke lokasi TPS Pengolah, dihitung dengan rumus haversine (radius bumi 6.371 km); radius maksimal dari sampah ke TPS adalah 15 km. Jarak rute jalan dari OSRM hanya dipakai untuk menampilkan rute penjemputan pada peta, bukan untuk menghitung skor. Aturan skor tiap kriteria adalah sebagai berikut.</w:t>
       </w:r>
     </w:p>
     <w:tbl>
@@ -4439,7 +4501,7 @@
                 <w:sz w:val="22"/>
                 <w:szCs w:val="22"/>
               </w:rPr>
-              <w:t>Sisa kapasitas hari ini / berat sampah &gt;= 1: 1,0. &gt;= 0,5: 0,6. &gt; 0: 0,3. Sisa 0: 0,0.</w:t>
+              <w:t>min(sisa kapasitas TPS, kapasitas kurir) / berat sampah &gt;= 1: 1,0. &gt;= 0,5: 0,6. &gt; 0: 0,3. Sisa 0: 0,0.</w:t>
             </w:r>
           </w:p>
         </w:tc>
@@ -4531,7 +4593,7 @@
                 <w:sz w:val="22"/>
                 <w:szCs w:val="22"/>
               </w:rPr>
-              <w:t>&lt;= 1 km: 1,0. &gt;= 15 km: 0,0 (di luar radius). Di antaranya turun linear.</w:t>
+              <w:t>&lt;= 1 km: 1,0. &gt;= 15 km: 0,0 (di luar radius). Di antaranya turun linear. Jarak diukur dari lokasi sampah ke TPS.</w:t>
             </w:r>
           </w:p>
         </w:tc>
@@ -4707,11 +4769,9 @@
         <w:jc w:val="both"/>
       </w:pPr>
       <w:r>
-        <w:t xml:space="preserve">Log transaksi historis dari sistem produksi belum tersedia dan data pengguna asli bersifat privat, sehingga evaluasi memakai evaluation set berupa skenario sintetis terkontrol. Setiap skenario berisi 6 sampah, 6 TPS Pengolah, dan 3 kurir yang dibangkitkan acak dengan seed tetap 0 sampai 29 agar hasilnya dapat direproduksi persis. Variasi mencakup jam sejak waktu produksi (1, 4, 8, 16, 30 jam), tingkat pembusukan, berat sampah (kg), dan kapasitas TPS (30, 50, 70, 100 kg/hari). Kedua strategi dijalankan pada </w:t>
+        <w:t>Log transaksi historis dari sistem produksi belum tersedia dan data pengguna asli bersifat privat, sehingga evaluasi memakai evaluation set berupa skenario sintetis terkontrol. Setiap skenario berisi 6 sampah, 6 TPS Pengolah, dan 3 kurir yang dibangkitkan acak oleh generator deterministik mulberry32 dengan seed tetap 0 sampai 29 agar hasilnya dapat direproduksi persis. Variasi mencakup umur sampah sejak produksi (1, 4, 8, 14, 18, 26, dan 40 jam), berat sampah 5-60 kg, kapasitas TPS 50-300 kg/hari, dan kapasitas kurir 30, 50, 70, atau 100 kg; lokasi dibangkitkan dalam batas koordinat Kota Madiun. Kedua strategi dijalankan pada skenario yang sama, sehingga perbandingannya adil. Karena tidak ada proses training, tidak ada pemisahan data latih dan data uji, dan risiko data leakage tidak berlaku.</w:t>
       </w:r>
-      <w:r>
-        <w:t>skenario yang sama, sehingga perbandingannya adil. Karena tidak ada proses training, tidak ada pemisahan data latih dan data uji, dan risiko data leakage tidak berlaku.</w:t>
-      </w:r>
+      <w:r/>
     </w:p>
     <w:p>
       <w:r>
@@ -4733,7 +4793,7 @@
         <w:jc w:val="both"/>
       </w:pPr>
       <w:r>
-        <w:t>Karena AI Routing adalah algoritma dan bukan model terlatih, tidak ada file .pkl maupun vector database. Artefak yang diserahkan berupa kode dan parameter (ai_matching/matching.py, config/routing.json, KONTRAK.md, requirements.txt). Kode matching.py diuji menghasilkan alokasi yang identik dengan notebook pada seluruh 30 skenario.</w:t>
+        <w:t>Karena AI Routing adalah algoritma dan bukan model terlatih, tidak ada file .pkl maupun vector database. Artefak yang diserahkan berupa kode dan parameter (ai_matching/routing.py, ai_matching/klasifikasi.py, ai_matching/main.py, config/routing.json, requirements.txt). Seluruh angka pada Bab 3 dihasilkan langsung oleh kode produksi tersebut, sehingga laporan dan sistem yang berjalan tidak pernah berbeda.</w:t>
       </w:r>
     </w:p>
     <w:tbl>
@@ -4858,7 +4918,7 @@
                 <w:sz w:val="22"/>
                 <w:szCs w:val="22"/>
               </w:rPr>
-              <w:t>ai_matching/matching.py</w:t>
+              <w:t>ai_matching/routing.py</w:t>
             </w:r>
           </w:p>
         </w:tc>
@@ -4887,7 +4947,7 @@
                 <w:sz w:val="22"/>
                 <w:szCs w:val="22"/>
               </w:rPr>
-              <w:t>Port Python dari routing.js. Fungsi utama hitung skor dan greedy assignment.</w:t>
+              <w:t>Port Python dari routing.js: hitung_skor() dan hitung_routing() (filter aturan + greedy assignment).</w:t>
             </w:r>
           </w:p>
         </w:tc>
@@ -4984,7 +5044,7 @@
                 <w:sz w:val="22"/>
                 <w:szCs w:val="22"/>
               </w:rPr>
-              <w:t>KONTRAK.md</w:t>
+              <w:t>ai_matching/main.py dan klasifikasi.py</w:t>
             </w:r>
           </w:p>
         </w:tc>
@@ -5013,7 +5073,7 @@
                 <w:sz w:val="22"/>
                 <w:szCs w:val="22"/>
               </w:rPr>
-              <w:t>Panduan backend: input, langkah alur yang wajib dijalankan, format keluaran.</w:t>
+              <w:t>Layanan FastAPI /v1/routing dan /v1/classify; klasifikasi rule-based dengan ambang pembusukan 12/24 jam.</w:t>
             </w:r>
           </w:p>
         </w:tc>
@@ -5076,7 +5136,7 @@
                 <w:sz w:val="22"/>
                 <w:szCs w:val="22"/>
               </w:rPr>
-              <w:t>Dependensi (pandas dan numpy hanya untuk notebook evaluasi).</w:t>
+              <w:t>Dependensi layanan Python: fastapi dan uvicorn.</w:t>
             </w:r>
           </w:p>
         </w:tc>
@@ -5103,7 +5163,7 @@
         <w:jc w:val="both"/>
       </w:pPr>
       <w:r>
-        <w:t>Kode produksi asli tetap berada di repository tim (server/lib/routing.js, server/lib/gis.js, ai_matching/matching.py, config/routing.json). Cara memakai matching.py oleh backend:</w:t>
+        <w:t>Kode produksi asli tetap berada di repository tim (server/lib/routing.js, server/lib/gis.js, ai_matching/routing.py, config/routing.json). Cara memakai ai_matching/routing.py dari layanan Python:</w:t>
       </w:r>
     </w:p>
     <w:p>
@@ -5117,7 +5177,7 @@
           <w:sz w:val="20"/>
           <w:szCs w:val="20"/>
         </w:rPr>
-        <w:t>cfg = muat_konfigurasi('config/routing.json')</w:t>
+        <w:t>cfg = load_config('config/routing.json')</w:t>
       </w:r>
     </w:p>
     <w:p>
@@ -5131,7 +5191,7 @@
           <w:sz w:val="20"/>
           <w:szCs w:val="20"/>
         </w:rPr>
-        <w:t>hasil = ke_keluaran(hitung_routing(sampah, tps, kurir, cfg))</w:t>
+        <w:t>hasil = hitung_routing(sampah, tps, kurir, now_ms, cfg)</w:t>
       </w:r>
     </w:p>
     <w:p>
@@ -5175,7 +5235,7 @@
         <w:pStyle w:val="Heading2"/>
       </w:pPr>
       <w:r>
-        <w:t>Catatan: angka evaluasi pada bagian ini berasal dari rangkaian uji 30 skenario terakhir dan akan dijalankan ulang dengan konfigurasi final EcoMatch (bobot jenis_cocok/kapasitas/jarak/urgensi, radius 15 km, data TPS Pengolah Kota Madiun) pada tahap evaluasi akhir sistem.</w:t>
+        <w:t>Catatan: seluruh angka evaluasi pada bagian ini berasal dari rangkaian uji 30 skenario terakhir dengan konfigurasi final EcoMatch (bobot 0,35/0,25/0,25/0,15, radius 15 km, BATAS_SKOR 0,3, data sintetis Kota Madiun) yang dijalankan skrip scripts/evaluasi-30-skenario.js; hasil lengkap tersimpan di docs/pengujian/evaluasi-30-skenario.json.</w:t>
       </w:r>
     </w:p>
     <w:p>
@@ -5192,11 +5252,9 @@
         <w:jc w:val="both"/>
       </w:pPr>
       <w:r>
-        <w:t>Evaluasi memakai 30 skenario sintetis dengan seed</w:t>
+        <w:t>Evaluasi memakai 30 skenario sintetis dengan seed tetap 0-29 yang dibangkitkan deterministik dalam batas koordinat Kota Madiun. Baseline Greedy Jarak-Saja memakai filter aturan yang sama (radius 15 km, jenis olahan, kapasitas), tetapi mengurutkan kandidat dari trip terpendek (kurir ke sampah ke TPS) tanpa penerapan BATAS_SKOR. Nilai pada tabel dilaporkan sebagai rata-rata plus-minus simpangan baku dari 30 skenario.</w:t>
       </w:r>
-      <w:r>
-        <w:t xml:space="preserve"> tetap (0–29). Setiap skenario diperlakukan seperti satu fold pada cross-validation, dan nilai dilaporkan sebagai rata-rata ± simpangan baku.</w:t>
-      </w:r>
+      <w:r/>
     </w:p>
     <w:tbl>
       <w:tblPr>
@@ -5475,7 +5533,7 @@
                 <w:sz w:val="22"/>
                 <w:szCs w:val="22"/>
               </w:rPr>
-              <w:t>79,17 ± 18,31</w:t>
+              <w:t>30,18 ± 6,74</w:t>
             </w:r>
           </w:p>
         </w:tc>
@@ -5504,7 +5562,7 @@
                 <w:sz w:val="22"/>
                 <w:szCs w:val="22"/>
               </w:rPr>
-              <w:t>52,24 ± 13,54</w:t>
+              <w:t>20,68 ± 4,22</w:t>
             </w:r>
           </w:p>
         </w:tc>
@@ -5567,7 +5625,7 @@
                 <w:sz w:val="22"/>
                 <w:szCs w:val="22"/>
               </w:rPr>
-              <w:t>0,79 ± 0,05</w:t>
+              <w:t>0,91 ± 0,02</w:t>
             </w:r>
           </w:p>
         </w:tc>
@@ -5596,7 +5654,7 @@
                 <w:sz w:val="22"/>
                 <w:szCs w:val="22"/>
               </w:rPr>
-              <w:t>0,72 ± 0,06</w:t>
+              <w:t>0,83 ± 0,06</w:t>
             </w:r>
           </w:p>
         </w:tc>
@@ -5659,7 +5717,7 @@
                 <w:sz w:val="22"/>
                 <w:szCs w:val="22"/>
               </w:rPr>
-              <w:t>97,53 ± 8,90</w:t>
+              <w:t>87,68 ± 26,69</w:t>
             </w:r>
           </w:p>
         </w:tc>
@@ -5688,7 +5746,7 @@
                 <w:sz w:val="22"/>
                 <w:szCs w:val="22"/>
               </w:rPr>
-              <w:t>38,89 ± 36,69</w:t>
+              <w:t>56,88 ± 42,84</w:t>
             </w:r>
           </w:p>
         </w:tc>
@@ -5751,7 +5809,7 @@
                 <w:sz w:val="22"/>
                 <w:szCs w:val="22"/>
               </w:rPr>
-              <w:t>95,91 ± 13,33</w:t>
+              <w:t>58,00 ± 39,12</w:t>
             </w:r>
           </w:p>
         </w:tc>
@@ -5780,7 +5838,99 @@
                 <w:sz w:val="22"/>
                 <w:szCs w:val="22"/>
               </w:rPr>
-              <w:t>56,36 ± 44,86</w:t>
+              <w:t>62,00 ± 36,81</w:t>
+            </w:r>
+          </w:p>
+        </w:tc>
+      </w:tr>
+      <w:tr>
+        <w:trPr>
+          <w:cantSplit/>
+        </w:trPr>
+        <w:tc>
+          <w:tcPr>
+            <w:tcW w:w="3000" w:type="dxa"/>
+            <w:tcBorders>
+              <w:top w:val="single" w:sz="4" w:space="0" w:color="000000"/>
+              <w:left w:val="single" w:sz="4" w:space="0" w:color="000000"/>
+              <w:bottom w:val="single" w:sz="4" w:space="0" w:color="000000"/>
+              <w:right w:val="single" w:sz="4" w:space="0" w:color="000000"/>
+            </w:tcBorders>
+            <w:tcMar>
+              <w:top w:w="60" w:type="dxa"/>
+              <w:left w:w="100" w:type="dxa"/>
+              <w:bottom w:w="60" w:type="dxa"/>
+              <w:right w:w="100" w:type="dxa"/>
+            </w:tcMar>
+          </w:tcPr>
+          <w:p>
+            <w:pPr>
+              <w:keepNext/>
+            </w:pPr>
+            <w:r>
+              <w:rPr>
+                <w:sz w:val="22"/>
+                <w:szCs w:val="22"/>
+              </w:rPr>
+              <w:t>% sampah tidak segar (sedang/busuk) teralokasi</w:t>
+            </w:r>
+          </w:p>
+        </w:tc>
+        <w:tc>
+          <w:tcPr>
+            <w:tcW w:w="3013" w:type="dxa"/>
+            <w:tcBorders>
+              <w:top w:val="single" w:sz="4" w:space="0" w:color="000000"/>
+              <w:left w:val="single" w:sz="4" w:space="0" w:color="000000"/>
+              <w:bottom w:val="single" w:sz="4" w:space="0" w:color="000000"/>
+              <w:right w:val="single" w:sz="4" w:space="0" w:color="000000"/>
+            </w:tcBorders>
+            <w:tcMar>
+              <w:top w:w="60" w:type="dxa"/>
+              <w:left w:w="100" w:type="dxa"/>
+              <w:bottom w:w="60" w:type="dxa"/>
+              <w:right w:w="100" w:type="dxa"/>
+            </w:tcMar>
+          </w:tcPr>
+          <w:p>
+            <w:pPr>
+              <w:keepNext/>
+            </w:pPr>
+            <w:r>
+              <w:rPr>
+                <w:sz w:val="22"/>
+                <w:szCs w:val="22"/>
+              </w:rPr>
+              <w:t>73,78 ± 24,76</w:t>
+            </w:r>
+          </w:p>
+        </w:tc>
+        <w:tc>
+          <w:tcPr>
+            <w:tcW w:w="3013" w:type="dxa"/>
+            <w:tcBorders>
+              <w:top w:val="single" w:sz="4" w:space="0" w:color="000000"/>
+              <w:left w:val="single" w:sz="4" w:space="0" w:color="000000"/>
+              <w:bottom w:val="single" w:sz="4" w:space="0" w:color="000000"/>
+              <w:right w:val="single" w:sz="4" w:space="0" w:color="000000"/>
+            </w:tcBorders>
+            <w:tcMar>
+              <w:top w:w="60" w:type="dxa"/>
+              <w:left w:w="100" w:type="dxa"/>
+              <w:bottom w:w="60" w:type="dxa"/>
+              <w:right w:w="100" w:type="dxa"/>
+            </w:tcMar>
+          </w:tcPr>
+          <w:p>
+            <w:pPr>
+              <w:keepNext/>
+            </w:pPr>
+            <w:r>
+              <w:rPr>
+                <w:sz w:val="22"/>
+                <w:szCs w:val="22"/>
+              </w:rPr>
+              <w:t>56,33 ± 30,99</w:t>
             </w:r>
           </w:p>
         </w:tc>
@@ -5871,7 +6021,7 @@
         <w:jc w:val="both"/>
       </w:pPr>
       <w:r>
-        <w:t>Cakupan sama persis (50%) karena dibatasi jumlah kurir (3 per skenario untuk 6 sampah), bukan kualitas skor. Baseline menempuh jarak lebih pendek karena memang hanya mengejar jarak. Namun pada metrik yang mewakili tujuan sistem, AI Routing jauh lebih unggul: sampah urgensi tinggi teralokasi 97,53% dibanding 38,89%, dan sampah hampir busuk tersalurkan 95,91% dibanding 56,36%. Simpangan baku baseline juga jauh lebih besar (36,69 dan 44,86), artinya hasilnya tidak konsisten dari skenario ke skenario.</w:t>
+        <w:t>Cakupan sama persis (50%) karena dibatasi jumlah kurir (3 per skenario untuk 6 sampah), bukan kualitas skor. Baseline menempuh jarak lebih pendek karena memang hanya mengejar jarak (20,68 km berbanding 30,18 km). Pada sampah yang paling mendesak, AI Routing unggul: sampah busuk teralokasi 87,68% berbanding 56,88%. Pada sampah sedang hasilnya praktis setara (58,00% berbanding 62,00%) karena baseline tetap mengalokasikan sampah sedang yang kebetulan dekat; namun bila digabung, 73,78% sampah tidak segar tersalur lewat AI Routing berbanding 56,33%. Skor kualitas juga lebih tinggi (0,91 berbanding 0,83), dan simpangan baku baseline pada metrik sampah busuk jauh lebih besar (42,84 berbanding 26,69), artinya hasil baseline tidak konsisten dari skenario ke skenario.</w:t>
       </w:r>
     </w:p>
     <w:p>
@@ -6208,7 +6358,7 @@
                 <w:sz w:val="22"/>
                 <w:szCs w:val="22"/>
               </w:rPr>
-              <w:t>69,47</w:t>
+              <w:t>31,32</w:t>
             </w:r>
           </w:p>
         </w:tc>
@@ -6237,7 +6387,7 @@
                 <w:sz w:val="22"/>
                 <w:szCs w:val="22"/>
               </w:rPr>
-              <w:t>0,79</w:t>
+              <w:t>0,94</w:t>
             </w:r>
           </w:p>
         </w:tc>
@@ -6295,7 +6445,7 @@
                 <w:sz w:val="22"/>
                 <w:szCs w:val="22"/>
               </w:rPr>
-              <w:t>100</w:t>
+              <w:t>50</w:t>
             </w:r>
           </w:p>
         </w:tc>
@@ -6387,7 +6537,7 @@
                 <w:sz w:val="22"/>
                 <w:szCs w:val="22"/>
               </w:rPr>
-              <w:t>54,90</w:t>
+              <w:t>26,72</w:t>
             </w:r>
           </w:p>
         </w:tc>
@@ -6416,7 +6566,7 @@
                 <w:sz w:val="22"/>
                 <w:szCs w:val="22"/>
               </w:rPr>
-              <w:t>0,71</w:t>
+              <w:t>0,85</w:t>
             </w:r>
           </w:p>
         </w:tc>
@@ -6474,7 +6624,7 @@
                 <w:sz w:val="22"/>
                 <w:szCs w:val="22"/>
               </w:rPr>
-              <w:t>100</w:t>
+              <w:t>50</w:t>
             </w:r>
           </w:p>
         </w:tc>
@@ -6566,7 +6716,7 @@
                 <w:sz w:val="22"/>
                 <w:szCs w:val="22"/>
               </w:rPr>
-              <w:t>116,05</w:t>
+              <w:t>19,15</w:t>
             </w:r>
           </w:p>
         </w:tc>
@@ -6595,7 +6745,7 @@
                 <w:sz w:val="22"/>
                 <w:szCs w:val="22"/>
               </w:rPr>
-              <w:t>0,74</w:t>
+              <w:t>0,92</w:t>
             </w:r>
           </w:p>
         </w:tc>
@@ -6624,7 +6774,7 @@
                 <w:sz w:val="22"/>
                 <w:szCs w:val="22"/>
               </w:rPr>
-              <w:t>100</w:t>
+              <w:t>-</w:t>
             </w:r>
           </w:p>
         </w:tc>
@@ -6745,7 +6895,7 @@
                 <w:sz w:val="22"/>
                 <w:szCs w:val="22"/>
               </w:rPr>
-              <w:t>90,47</w:t>
+              <w:t>11,43</w:t>
             </w:r>
           </w:p>
         </w:tc>
@@ -6774,7 +6924,7 @@
                 <w:sz w:val="22"/>
                 <w:szCs w:val="22"/>
               </w:rPr>
-              <w:t>0,69</w:t>
+              <w:t>0,81</w:t>
             </w:r>
           </w:p>
         </w:tc>
@@ -6803,7 +6953,7 @@
                 <w:sz w:val="22"/>
                 <w:szCs w:val="22"/>
               </w:rPr>
-              <w:t>66,67</w:t>
+              <w:t>-</w:t>
             </w:r>
           </w:p>
         </w:tc>
@@ -6832,7 +6982,7 @@
                 <w:sz w:val="22"/>
                 <w:szCs w:val="22"/>
               </w:rPr>
-              <w:t>0</w:t>
+              <w:t>33,33</w:t>
             </w:r>
           </w:p>
         </w:tc>
@@ -6924,7 +7074,7 @@
                 <w:sz w:val="22"/>
                 <w:szCs w:val="22"/>
               </w:rPr>
-              <w:t>83,40</w:t>
+              <w:t>39,03</w:t>
             </w:r>
           </w:p>
         </w:tc>
@@ -6953,7 +7103,7 @@
                 <w:sz w:val="22"/>
                 <w:szCs w:val="22"/>
               </w:rPr>
-              <w:t>0,81</w:t>
+              <w:t>0,89</w:t>
             </w:r>
           </w:p>
         </w:tc>
@@ -7011,7 +7161,7 @@
                 <w:sz w:val="22"/>
                 <w:szCs w:val="22"/>
               </w:rPr>
-              <w:t>100</w:t>
+              <w:t>66,67</w:t>
             </w:r>
           </w:p>
         </w:tc>
@@ -7103,7 +7253,7 @@
                 <w:sz w:val="22"/>
                 <w:szCs w:val="22"/>
               </w:rPr>
-              <w:t>45,16</w:t>
+              <w:t>20,43</w:t>
             </w:r>
           </w:p>
         </w:tc>
@@ -7190,7 +7340,7 @@
                 <w:sz w:val="22"/>
                 <w:szCs w:val="22"/>
               </w:rPr>
-              <w:t>50</w:t>
+              <w:t>33,33</w:t>
             </w:r>
           </w:p>
         </w:tc>
@@ -7282,7 +7432,7 @@
                 <w:sz w:val="22"/>
                 <w:szCs w:val="22"/>
               </w:rPr>
-              <w:t>82,20</w:t>
+              <w:t>29,18</w:t>
             </w:r>
           </w:p>
         </w:tc>
@@ -7311,7 +7461,7 @@
                 <w:sz w:val="22"/>
                 <w:szCs w:val="22"/>
               </w:rPr>
-              <w:t>0,72</w:t>
+              <w:t>0,90</w:t>
             </w:r>
           </w:p>
         </w:tc>
@@ -7369,7 +7519,7 @@
                 <w:sz w:val="22"/>
                 <w:szCs w:val="22"/>
               </w:rPr>
-              <w:t>-</w:t>
+              <w:t>100</w:t>
             </w:r>
           </w:p>
         </w:tc>
@@ -7461,7 +7611,7 @@
                 <w:sz w:val="22"/>
                 <w:szCs w:val="22"/>
               </w:rPr>
-              <w:t>51,12</w:t>
+              <w:t>23,64</w:t>
             </w:r>
           </w:p>
         </w:tc>
@@ -7490,7 +7640,7 @@
                 <w:sz w:val="22"/>
                 <w:szCs w:val="22"/>
               </w:rPr>
-              <w:t>0,62</w:t>
+              <w:t>0,78</w:t>
             </w:r>
           </w:p>
         </w:tc>
@@ -7519,7 +7669,7 @@
                 <w:sz w:val="22"/>
                 <w:szCs w:val="22"/>
               </w:rPr>
-              <w:t>50</w:t>
+              <w:t>0</w:t>
             </w:r>
           </w:p>
         </w:tc>
@@ -7548,7 +7698,7 @@
                 <w:sz w:val="22"/>
                 <w:szCs w:val="22"/>
               </w:rPr>
-              <w:t>-</w:t>
+              <w:t>100</w:t>
             </w:r>
           </w:p>
         </w:tc>
@@ -7640,7 +7790,7 @@
                 <w:sz w:val="22"/>
                 <w:szCs w:val="22"/>
               </w:rPr>
-              <w:t>89,54</w:t>
+              <w:t>26,99</w:t>
             </w:r>
           </w:p>
         </w:tc>
@@ -7669,7 +7819,7 @@
                 <w:sz w:val="22"/>
                 <w:szCs w:val="22"/>
               </w:rPr>
-              <w:t>0,80</w:t>
+              <w:t>0,89</w:t>
             </w:r>
           </w:p>
         </w:tc>
@@ -7698,7 +7848,7 @@
                 <w:sz w:val="22"/>
                 <w:szCs w:val="22"/>
               </w:rPr>
-              <w:t>100</w:t>
+              <w:t>-</w:t>
             </w:r>
           </w:p>
         </w:tc>
@@ -7819,7 +7969,7 @@
                 <w:sz w:val="22"/>
                 <w:szCs w:val="22"/>
               </w:rPr>
-              <w:t>55,60</w:t>
+              <w:t>20,66</w:t>
             </w:r>
           </w:p>
         </w:tc>
@@ -7848,7 +7998,7 @@
                 <w:sz w:val="22"/>
                 <w:szCs w:val="22"/>
               </w:rPr>
-              <w:t>0,73</w:t>
+              <w:t>0,79</w:t>
             </w:r>
           </w:p>
         </w:tc>
@@ -7877,7 +8027,7 @@
                 <w:sz w:val="22"/>
                 <w:szCs w:val="22"/>
               </w:rPr>
-              <w:t>0</w:t>
+              <w:t>-</w:t>
             </w:r>
           </w:p>
         </w:tc>
@@ -7946,7 +8096,7 @@
         <w:spacing w:after="80" w:line="340" w:lineRule="auto"/>
       </w:pPr>
       <w:r>
-        <w:t>Sampah urgensi tinggi (27 skenario memilikinya): AI Routing lebih baik di 21 skenario, sama di 6 skenario, dan tidak pernah lebih buruk.</w:t>
+        <w:t>Sampah busuk/urgensi tinggi (23 skenario memilikinya): AI Routing lebih baik di 10 skenario, sama di 13 skenario, dan tidak pernah lebih buruk.</w:t>
       </w:r>
     </w:p>
     <w:p>
@@ -7959,7 +8109,7 @@
         <w:spacing w:after="80" w:line="340" w:lineRule="auto"/>
       </w:pPr>
       <w:r>
-        <w:t>Sampah hampir busuk (22 skenario memilikinya): AI Routing lebih baik di 11 skenario, sama di 11 skenario, dan tidak pernah lebih buruk.</w:t>
+        <w:t>Sampah sedang/hampir busuk (25 skenario memilikinya): AI Routing lebih baik di 4 skenario, sama di 17 skenario, dan lebih buruk di 4 skenario; rata-ratanya praktis setara (58,00% berbanding 62,00%).</w:t>
       </w:r>
     </w:p>
     <w:p>
@@ -7972,7 +8122,7 @@
         <w:spacing w:after="80" w:line="340" w:lineRule="auto"/>
       </w:pPr>
       <w:r>
-        <w:t>Skor kualitas rata-rata: AI Routing lebih tinggi di 29 dari 30 skenario.</w:t>
+        <w:t>Sampah tidak segar (gabungan sedang dan busuk, 30 skenario): AI Routing lebih baik di 13 skenario, sama di 15 skenario, dan lebih buruk di 2 skenario; rata-rata 73,78% berbanding 56,33%.</w:t>
       </w:r>
     </w:p>
     <w:p>
@@ -7985,7 +8135,20 @@
         <w:spacing w:after="80" w:line="340" w:lineRule="auto"/>
       </w:pPr>
       <w:r>
-        <w:t>Total jarak: baseline lebih pendek di seluruh 30 skenario. Rata-rata jarak per pasangan 26,4 km (AI Routing) berbanding 17,4 km (baseline); pasangan terjauh yang pernah dipilih AI Routing adalah 69,5 km.</w:t>
+        <w:t>Skor kualitas rata-rata: AI Routing lebih tinggi di 26 skenario, sama di 4 skenario, dan tidak pernah lebih rendah.</w:t>
+      </w:r>
+    </w:p>
+    <w:p>
+      <w:pPr>
+        <w:pStyle w:val="ListParagraph"/>
+        <w:numPr>
+          <w:ilvl w:val="0"/>
+          <w:numId w:val="2"/>
+        </w:numPr>
+        <w:spacing w:after="80" w:line="340" w:lineRule="auto"/>
+      </w:pPr>
+      <w:r>
+        <w:t>Total jarak: baseline lebih pendek di 28 skenario, sama di 1 skenario, dan AI Routing lebih pendek di 1 skenario. Rata-rata jarak per pasangan 10,1 km (AI Routing) berbanding 6,9 km (baseline); pasangan terjauh yang pernah dipilih AI Routing adalah 18,0 km, sedangkan baseline 13,7 km.</w:t>
       </w:r>
     </w:p>
     <w:p>
@@ -8229,7 +8392,7 @@
                 <w:sz w:val="22"/>
                 <w:szCs w:val="22"/>
               </w:rPr>
-              <w:t>0,789</w:t>
+              <w:t>0,910</w:t>
             </w:r>
           </w:p>
         </w:tc>
@@ -8321,7 +8484,7 @@
                 <w:sz w:val="22"/>
                 <w:szCs w:val="22"/>
               </w:rPr>
-              <w:t>0,789</w:t>
+              <w:t>0,910</w:t>
             </w:r>
           </w:p>
         </w:tc>
@@ -8413,7 +8576,7 @@
                 <w:sz w:val="22"/>
                 <w:szCs w:val="22"/>
               </w:rPr>
-              <w:t>0,789</w:t>
+              <w:t>0,910</w:t>
             </w:r>
           </w:p>
         </w:tc>
@@ -8476,7 +8639,7 @@
                 <w:sz w:val="22"/>
                 <w:szCs w:val="22"/>
               </w:rPr>
-              <w:t>2,90</w:t>
+              <w:t>3,00</w:t>
             </w:r>
           </w:p>
         </w:tc>
@@ -8505,7 +8668,7 @@
                 <w:sz w:val="22"/>
                 <w:szCs w:val="22"/>
               </w:rPr>
-              <w:t>0,797</w:t>
+              <w:t>0,910</w:t>
             </w:r>
           </w:p>
         </w:tc>
@@ -8568,7 +8731,7 @@
                 <w:sz w:val="22"/>
                 <w:szCs w:val="22"/>
               </w:rPr>
-              <w:t>2,40</w:t>
+              <w:t>3,00</w:t>
             </w:r>
           </w:p>
         </w:tc>
@@ -8597,7 +8760,7 @@
                 <w:sz w:val="22"/>
                 <w:szCs w:val="22"/>
               </w:rPr>
-              <w:t>0,829</w:t>
+              <w:t>0,910</w:t>
             </w:r>
           </w:p>
         </w:tc>
@@ -8660,7 +8823,7 @@
                 <w:sz w:val="22"/>
                 <w:szCs w:val="22"/>
               </w:rPr>
-              <w:t>2,00</w:t>
+              <w:t>3,00</w:t>
             </w:r>
           </w:p>
         </w:tc>
@@ -8689,7 +8852,7 @@
                 <w:sz w:val="22"/>
                 <w:szCs w:val="22"/>
               </w:rPr>
-              <w:t>0,846</w:t>
+              <w:t>0,910</w:t>
             </w:r>
           </w:p>
         </w:tc>
@@ -8752,7 +8915,7 @@
                 <w:sz w:val="22"/>
                 <w:szCs w:val="22"/>
               </w:rPr>
-              <w:t>1,43</w:t>
+              <w:t>2,90</w:t>
             </w:r>
           </w:p>
         </w:tc>
@@ -8781,7 +8944,7 @@
                 <w:sz w:val="22"/>
                 <w:szCs w:val="22"/>
               </w:rPr>
-              <w:t>0,848</w:t>
+              <w:t>0,915</w:t>
             </w:r>
           </w:p>
         </w:tc>
@@ -8844,7 +9007,7 @@
                 <w:sz w:val="22"/>
                 <w:szCs w:val="22"/>
               </w:rPr>
-              <w:t>0,93</w:t>
+              <w:t>2,70</w:t>
             </w:r>
           </w:p>
         </w:tc>
@@ -8873,7 +9036,7 @@
                 <w:sz w:val="22"/>
                 <w:szCs w:val="22"/>
               </w:rPr>
-              <w:t>0,720</w:t>
+              <w:t>0,922</w:t>
             </w:r>
           </w:p>
         </w:tc>
@@ -8936,7 +9099,7 @@
                 <w:sz w:val="22"/>
                 <w:szCs w:val="22"/>
               </w:rPr>
-              <w:t>0,47</w:t>
+              <w:t>1,57</w:t>
             </w:r>
           </w:p>
         </w:tc>
@@ -8965,7 +9128,7 @@
                 <w:sz w:val="22"/>
                 <w:szCs w:val="22"/>
               </w:rPr>
-              <w:t>0,401</w:t>
+              <w:t>0,856</w:t>
             </w:r>
           </w:p>
         </w:tc>
@@ -9056,7 +9219,7 @@
         <w:jc w:val="both"/>
       </w:pPr>
       <w:r>
-        <w:t>Pada ambang &lt;= 0,5 jumlah alokasi tetap 3,00, artinya hambatan sebenarnya adalah jumlah kurir. Nilai 0,3 berada di zona aman: tidak memotong pasangan valid, tetapi tetap menolak pasangan yang sangat buruk.</w:t>
+        <w:t>Pada ambang 0,10 sampai 0,75 jumlah alokasi tetap 3,00 dan rata-rata skor tetap 0,910, artinya hambatan sebenarnya adalah jumlah kurir (3 per skenario), bukan ambang skor. Ambang mulai membatasi pada 0,80 (alokasi 2,90) dan 0,85 (alokasi 2,70); pada 0,90 alokasi anjlok ke 1,57 dan rata-rata skor ikut turun ke 0,856 karena skenario yang kehilangan seluruh alokasi ikut diperhitungkan. Nilai 0,3 berada di zona aman: tidak memotong pasangan valid, tetapi tetap menolak pasangan yang sangat buruk.</w:t>
       </w:r>
     </w:p>
     <w:p>
@@ -9073,7 +9236,7 @@
         <w:jc w:val="both"/>
       </w:pPr>
       <w:r>
-        <w:t>NFR-02 pada SKPL menetapkan proses AI Routing tidak lebih dari 3 detik. Waktu eksekusi fungsi compute_matches() diukur pada mesin uji: rata-rata 0,18 milidetik per skenario (6 sampah, 6 TPS, 3 kurir), dan sekitar 0,14 detik untuk skenario yang jauh lebih besar (50 sampah, 50 TPS, 20 kurir). Angka ini hanya waktu komputasi algoritma; latensi jaringan dan database pada sistem sesungguhnya belum termasuk.</w:t>
+        <w:t>NFR-02 pada SKPL menetapkan proses AI Routing tidak lebih dari 3 detik. Waktu eksekusi fungsi hitungRouting() diukur pada mesin uji: rata-rata 0,29 milidetik per skenario (6 sampah, 6 TPS, 3 kurir), dan sekitar 0,21 detik untuk skenario yang jauh lebih besar (50 sampah, 50 TPS, 20 kurir). Angka ini hanya waktu komputasi algoritma; latensi jaringan dan database pada sistem sesungguhnya belum termasuk.</w:t>
       </w:r>
     </w:p>
     <w:p>
@@ -9304,7 +9467,7 @@
                 <w:sz w:val="22"/>
                 <w:szCs w:val="22"/>
               </w:rPr>
-              <w:t>Skenario seed=3. Sampah dari Donor MBG L3: 29 kg, sisa 4 jam (urgensi tinggi). TPS N0: jenis cocok. Kurir C0: kapasitas 100.</w:t>
+              <w:t>Skenario seed=3. Sampah S4 (sayur, 54 kg, umur 26 jam/busuk). TPS T4 menerima sayur dengan sisa kapasitas 90 kg. Kurir K0 berkapasitas 100 kg.</w:t>
             </w:r>
           </w:p>
         </w:tc>
@@ -9333,7 +9496,7 @@
                 <w:sz w:val="22"/>
                 <w:szCs w:val="22"/>
               </w:rPr>
-              <w:t>Jarak total 13,6 km. Skor: jenis_cocok 1,0; kapasitas 1,0; jarak 0,841; urgensi 0,85. Total = 0,35(1,0) + 0,25(1,0) + 0,25(0,841) + 0,15(0,85) = 0,938.</w:t>
+              <w:t>Jarak sampah ke TPS 3,4 km. Skor: jenis_cocok 1,0; kapasitas 1,0 (rasio min(90/54; 100/54) = 1,67); jarak 0,8286; urgensi 1,0 (busuk). Total = 0,35(1,0) + 0,25(1,0) + 0,25(0,8286) + 0,15(1,0) = 0,957, di atas ambang 0,3.</w:t>
             </w:r>
           </w:p>
         </w:tc>
@@ -9362,7 +9525,7 @@
                 <w:sz w:val="22"/>
                 <w:szCs w:val="22"/>
               </w:rPr>
-              <w:t>Pasangan L3-N0-C0, skor 0,938</w:t>
+              <w:t>Pasangan S4-T4-K0, skor 0,957 (trip penjemputan 12,8 km)</w:t>
             </w:r>
           </w:p>
         </w:tc>
@@ -9425,7 +9588,7 @@
                 <w:sz w:val="22"/>
                 <w:szCs w:val="22"/>
               </w:rPr>
-              <w:t>Skenario seed=3. Sampah dari Donor MBG L4: 76 kg, sisa 16 jam (urgensi sedang). TPS N3: jenis cocok. Kurir C2: kapasitas 50.</w:t>
+              <w:t>Skenario seed=3. Sampah S1 (sayur, 35 kg, umur 14 jam/sedang). TPS T3 menerima sayur dengan sisa kapasitas 200 kg. Kurir K1 hanya berkapasitas 30 kg.</w:t>
             </w:r>
           </w:p>
         </w:tc>
@@ -9454,7 +9617,7 @@
                 <w:sz w:val="22"/>
                 <w:szCs w:val="22"/>
               </w:rPr>
-              <w:t>Jarak total 35,1 km. Skor: jenis_cocok 1,0; kapasitas 0,2 (76 kg &gt; 1,5 x 50); jarak 0,569; urgensi 0,5. Total = 0,35(1,0) + 0,25(0,2) + 0,25(0,569) + 0,15(0,5) = 0,617, di atas ambang 0,3.</w:t>
+              <w:t>Skor kapasitas memakai min(sisa TPS, kapasitas kurir): min(200/35; 30/35) = 0,86, masuk kategori &gt;= 0,5 sehingga bernilai 0,6. Jenis_cocok 1,0; jarak 0,8277 (3,4 km); urgensi 0,6 (sedang). Total = 0,35(1,0) + 0,25(0,6) + 0,25(0,8277) + 0,15(0,6) = 0,797, di atas ambang 0,3.</w:t>
             </w:r>
           </w:p>
         </w:tc>
@@ -9483,7 +9646,7 @@
                 <w:sz w:val="22"/>
                 <w:szCs w:val="22"/>
               </w:rPr>
-              <w:t>Pasangan L4-N3-C2, skor 0,617</w:t>
+              <w:t>Pasangan S1-T3-K1, skor 0,797</w:t>
             </w:r>
           </w:p>
         </w:tc>
@@ -9546,7 +9709,7 @@
                 <w:sz w:val="22"/>
                 <w:szCs w:val="22"/>
               </w:rPr>
-              <w:t>Skenario seed=1. TPS dengan sampah urgensi tinggi: N3, N4, N5. Sampah dari Donor MBG L5 hanya berumur 1 jam.</w:t>
+              <w:t>Skenario seed=3 dengan dua sampah busuk (S4 umur 26 jam dan S5 umur 40 jam), satu sampah sedang (S1), dan tiga sampah segar (S0, S2, S3).</w:t>
             </w:r>
           </w:p>
         </w:tc>
@@ -9575,7 +9738,7 @@
                 <w:sz w:val="22"/>
                 <w:szCs w:val="22"/>
               </w:rPr>
-              <w:t>AI Routing memilih L4-N5-C2 (0,846), L5-N4-C0 (0,740), L1-N3-C1 (0,645). Jarak-Saja memilih L4-N5-C2, L1-N4-C1, dan L0-N0-C0 (N0 tanpa urgensi tinggi).</w:t>
+              <w:t>AI Routing memilih S4-T4-K0 (0,957), S5-T0-K2 (0,938), dan S1-T3-K1 (0,797) sehingga kedua sampah busuk tersalur. Greedy Jarak-Saja memilih S2-T0-K2 (0,853), S1-T3-K0 (0,897), dan S3-T4-K1 (0,577), tidak satu pun sampah busuk terkirim.</w:t>
             </w:r>
           </w:p>
         </w:tc>
@@ -9604,7 +9767,7 @@
                 <w:sz w:val="22"/>
                 <w:szCs w:val="22"/>
               </w:rPr>
-              <w:t>AI Routing: 3 sampah urgensi tinggi teralokasi, L5 tersalurkan, total 116,1 km. Jarak-Saja: 2 urgensi tinggi, L5 tidak tersalurkan, total 90,4 km</w:t>
+              <w:t>AI Routing: busuk 100% dan sedang 100% teralokasi, total jarak 29,2 km. Jarak-Saja: busuk 0%, sedang 100%, total jarak 23,6 km</w:t>
             </w:r>
           </w:p>
         </w:tc>
@@ -9622,7 +9785,7 @@
           <w:sz w:val="22"/>
           <w:szCs w:val="22"/>
         </w:rPr>
-        <w:t>Tabel 3.4 Simulasi input–proses–output (hasil dijalankan ulang dari kode notebook)</w:t>
+        <w:t>Tabel 3.4 Simulasi input-proses-output (hasil dijalankan ulang dari kode produksi)</w:t>
       </w:r>
     </w:p>
     <w:p>
@@ -9631,7 +9794,7 @@
         <w:jc w:val="both"/>
       </w:pPr>
       <w:r>
-        <w:t>Simulasi 3 menunjukkan alasan AI Routing dipilih: sampah dari Donor MBG L5 hanya berumur 1 jam sejak produksi, sehingga skor urgensinya maksimal. Sistem mengirimkannya ke TPS N4 dengan urgensi tinggi walau jaraknya 69,5 km, sedangkan baseline melewatkan L5 demi pasangan yang lebih dekat.</w:t>
+        <w:t>Simulasi menunjukkan alasan AI Routing dipilih: pada skenario seed 3 kedua sampah paling mendesak (S4 berumur 26 jam dan S5 berumur 40 jam) tetap tersalur ke TPS yang menerima jenisnya dengan skor 0,957 dan 0,938, sedangkan Greedy Jarak-Saja hanya memilih sampah segar dan sedang yang lebih dekat sehingga tidak satu pun sampah busuk terkirim.</w:t>
       </w:r>
     </w:p>
     <w:p>
@@ -9862,7 +10025,7 @@
                 <w:sz w:val="22"/>
                 <w:szCs w:val="22"/>
               </w:rPr>
-              <w:t>Skenario seed=3: TPS N1, N2, N5 tidak menerima alokasi (antrean sampah 48/35/36 kg, urgensi rendah).</w:t>
+              <w:t>Skenario seed=3: sampah S0 (47 kg), S2 (49 kg), dan S3 (42 kg), semuanya berumur 1-8 jam (segar), tidak mendapat alokasi.</w:t>
             </w:r>
           </w:p>
         </w:tc>
@@ -9891,7 +10054,7 @@
                 <w:sz w:val="22"/>
                 <w:szCs w:val="22"/>
               </w:rPr>
-              <w:t>Tidak terlayani dalam satu putaran computeMatches().</w:t>
+              <w:t>Hanya 3 dari 6 sampah teralokasi dalam satu putaran hitungRouting().</w:t>
             </w:r>
           </w:p>
         </w:tc>
@@ -9920,7 +10083,7 @@
                 <w:sz w:val="22"/>
                 <w:szCs w:val="22"/>
               </w:rPr>
-              <w:t>Hanya 3 kurir untuk 6 tujuan; greedy assignment satu-ke-satu per kurir, sehingga TPS berikutnya menunggu putaran berikutnya. Ini bottleneck armada, bukan kesalahan rumus skor.</w:t>
+              <w:t>Hanya 3 kurir untuk 6 sampah dengan aturan satu sampah-satu TPS-satu kurir; sampah busuk didahulukan lebih dulu. Ini bottleneck armada, bukan kesalahan rumus skor - sampah segar menunggu putaran berikutnya.</w:t>
             </w:r>
           </w:p>
         </w:tc>
@@ -9983,7 +10146,7 @@
                 <w:sz w:val="22"/>
                 <w:szCs w:val="22"/>
               </w:rPr>
-              <w:t>Pasangan L4–N3–C2 (seed=3).</w:t>
+              <w:t>Pasangan S3-T0-K0 (seed=23): sampah busuk 41 kg dengan kurir K0 di ujung utara kota.</w:t>
             </w:r>
           </w:p>
         </w:tc>
@@ -10012,7 +10175,7 @@
                 <w:sz w:val="22"/>
                 <w:szCs w:val="22"/>
               </w:rPr>
-              <w:t>Jarak 35,1 km dengan skor 0,617.</w:t>
+              <w:t>Trip total 18,0 km dengan skor 0,950; jarak sampah ke TPS hanya 3,8 km.</w:t>
             </w:r>
           </w:p>
         </w:tc>
@@ -10041,7 +10204,7 @@
                 <w:sz w:val="22"/>
                 <w:szCs w:val="22"/>
               </w:rPr>
-              <w:t>Bobot jarak hanya 0,25, sehingga urgensi tinggi bisa menutupi jarak jauh dan kapasitas yang tidak cukup (skor kapasitas 0,2). Di pinggiran Kab. Madiun jarak melewati radius layanan 15 km sehingga perlu verifikasi admin.</w:t>
+              <w:t>Skor jarak hanya mengukur jarak sampah ke TPS (0,799), sementara leg penjemputan kurir ke sampah (14,2 km) tidak ikut dinilai maupun dibatasi radius 15 km, sehingga trip total bisa melebihi radius layanan.</w:t>
             </w:r>
           </w:p>
         </w:tc>
@@ -10133,7 +10296,7 @@
                 <w:sz w:val="22"/>
                 <w:szCs w:val="22"/>
               </w:rPr>
-              <w:t>Rata-rata skor kualitas turun (0,720 lalu 0,401), padahal ambang naik.</w:t>
+              <w:t>Rata-rata jumlah alokasi turun dari 3,00 (ambang 0,10-0,75) menjadi 2,70 pada 0,85 dan 1,57 pada 0,90; rata-rata skor justru turun ke 0,856 pada 0,90.</w:t>
             </w:r>
           </w:p>
         </w:tc>
@@ -10162,7 +10325,7 @@
                 <w:sz w:val="22"/>
                 <w:szCs w:val="22"/>
               </w:rPr>
-              <w:t>Kandidat yang lolos sangat sedikit (0–1 per skenario), sehingga rata-rata dihitung dari sampel kecil yang tidak stabil.</w:t>
+              <w:t>Kandidat yang lolos sangat sedikit dan skenario tanpa alokasi dihitung bernilai 0, sehingga rata-rata tidak stabil; ambang 0,90 terlalu ketat dan membuang pasangan yang masih layak.</w:t>
             </w:r>
           </w:p>
         </w:tc>
@@ -10225,7 +10388,7 @@
         <w:jc w:val="both"/>
       </w:pPr>
       <w:r>
-        <w:t>EcoMatch menyelesaikan masalah penyaluran sampah makanan MBG dengan fitur AI Routing berupa algoritma optimasi: skor multi-kriteria berbobot (jenis_cocok, kapasitas, jarak, urgensi) yang dilanjutkan greedy assignment, ditambah klasifikasi jenis sampah berbasis aturan. Komponen ini tidak dilatih dari data historis, sehingga artefak yang diserahkan berupa kode dan parameter (ai_matching/matching.py, config/routing.json, KONTRAK.md, requirements.txt), bukan file model.</w:t>
+        <w:t>EcoMatch menyelesaikan masalah penyaluran sampah makanan MBG dengan fitur AI Routing berupa algoritma optimasi: skor multi-kriteria berbobot (jenis_cocok, kapasitas, jarak, urgensi) yang dilanjutkan greedy assignment, ditambah klasifikasi jenis sampah berbasis aturan. Komponen ini tidak dilatih dari data historis, sehingga artefak yang diserahkan berupa kode dan parameter (ai_matching/routing.py, ai_matching/klasifikasi.py, ai_matching/main.py, config/routing.json, requirements.txt), bukan file model.</w:t>
       </w:r>
     </w:p>
     <w:p>
@@ -10234,7 +10397,7 @@
         <w:jc w:val="both"/>
       </w:pPr>
       <w:r>
-        <w:t>Pada evaluasi 30 skenario sintetis, konfigurasi AI Routing mengungguli baseline Greedy Jarak-Saja pada metrik yang mewakili tujuan sistem: sampah urgensi tinggi teralokasi 97,53% (baseline 38,89%) dan sampah hampir busuk tersalurkan 95,91% (baseline 56,36%). Keunggulan itu konsisten: tidak ada skenario yang hasilnya lebih buruk dari baseline. Harganya adalah jarak tempuh yang lebih jauh (79,17 km berbanding 52,24 km). Ambang skor 0,3 dipertahankan karena berada di zona aman pada uji sensitivitas.</w:t>
+        <w:t>Pada evaluasi 30 skenario sintetis, konfigurasi AI Routing mengungguli baseline Greedy Jarak-Saja pada metrik yang mewakili tujuan sistem: sampah busuk teralokasi 87,68% (baseline 56,88%), gabungan sampah tidak segar tersalur 73,78% (baseline 56,33%), dan skor kualitas 0,91 (baseline 0,83). Pada sampah sedang hasilnya praktis setara (58,00% berbanding 62,00%). Harganya adalah jarak tempuh yang lebih jauh (30,18 km berbanding 20,68 km). Ambang skor 0,3 dipertahankan karena berada di zona aman pada uji sensitivitas: jumlah alokasi tetap 3,00 pada ambang 0,10 sampai 0,75.</w:t>
       </w:r>
     </w:p>
     <w:p>
@@ -10460,7 +10623,7 @@
                 <w:sz w:val="22"/>
                 <w:szCs w:val="22"/>
               </w:rPr>
-              <w:t>0,18 ms per skenario kecil dan sekitar 0,14 detik untuk skenario 50x50.</w:t>
+              <w:t>0,29 milidetik per skenario kecil (6 sampah x 6 TPS x 3 kurir) dan sekitar 0,21 detik untuk skenario besar (50 x 50 x 20), jauh di bawah SLA 3 detik.</w:t>
             </w:r>
           </w:p>
         </w:tc>
@@ -10763,11 +10926,9 @@
         <w:jc w:val="both"/>
       </w:pPr>
       <w:r>
-        <w:t>Keterbatasan: evaluasi memakai data sintetis, bukan log transaksi nyata; cakupan layanan dibatasi jumlah kurir; jarak dihitung garis lurus (haversine), bukan jarak jalan; dan pasangan berjarak jauh masih bisa terpilih. Saran pengembangan: menguji bobot dengan data pilot bersama pengelola MBG dan TPS Pengolah, memakai jarak rute jalan dari GIS Service (OSRM) pada filter, menambahkan verifikasi klasifikasi sebagai masukan skor urgensi, dan mengizinkan beberapa putaran alokasi agar sampah yang belum teralokasi</w:t>
+        <w:t>Keterbatasan: evaluasi memakai data sintetis, bukan log transaksi nyata; cakupan layanan dibatasi jumlah kurir; jarak dihitung garis lurus (haversine), bukan jarak jalan; skor jarak hanya mengukur jarak sampah ke TPS sehingga leg penjemputan kurir dapat membuat trip total melebihi radius 15 km; dan pasangan berjarak jauh masih bisa terpilih. Saran pengembangan: menguji bobot dengan data pilot bersama pengelola MBG dan TPS Pengolah, memakai jarak rute jalan dari GIS Service (OSRM) pada filter dan skor, menambahkan verifikasi klasifikasi sebagai masukan skor urgensi, dan mengizinkan beberapa putaran alokasi agar sampah yang belum teralokasi dilayani setelah kapasitas TPS tersedia.</w:t>
       </w:r>
-      <w:r>
-        <w:t xml:space="preserve"> dilayani setelah kapasitas TPS tersedia.</w:t>
-      </w:r>
+      <w:r/>
     </w:p>
     <w:p/>
     <w:sectPr>

</xml_diff>